<commit_message>
Refresh absinthe submission artifacts
</commit_message>
<xml_diff>
--- a/manuscript/jps-formatted/absinthe-jps-blinded-manuscript.docx
+++ b/manuscript/jps-formatted/absinthe-jps-blinded-manuscript.docx
@@ -97,7 +97,7 @@
     </w:p>
     <w:p>
       <w:r>
-        <w:t>Classic serotonergic psychedelics include psilocybin/psilocin, LSD, and mescaline. Across this class, agonism or partial agonism at cortical serotonin 5-HT2A receptors is the most reproducible mechanistic anchor, although receptor activation is necessary rather than sufficient for the full subjective state [3,5]. 5-HT2A is a G-protein-coupled receptor expressed prominently on cortical pyramidal neurons. Activation can engage Gq/11-linked phospholipase C signaling, intracellular calcium mobilization, excitability changes, and downstream circuit effects. Other serotonin receptors, glutamatergic signaling, network dynamics, learning, expectation, and set and setting contribute to the final experience.</w:t>
+        <w:t>Classic serotonergic psychedelics include psilocybin/psilocin, LSD, and mescaline. Across this class, agonism or partial agonism at cortical serotonin 5-HT2A receptors is the most reproducible mechanistic anchor, although receptor activation is necessary rather than sufficient for the full subjective state (González-Maeso et al., 2007; Nichols, 2016). 5-HT2A is a G-protein-coupled receptor expressed prominently on cortical pyramidal neurons. Activation can engage Gq/11-linked phospholipase C signaling, intracellular calcium mobilization, excitability changes, and downstream circuit effects. Other serotonin receptors, glutamatergic signaling, network dynamics, learning, expectation, and set and setting contribute to the final experience.</w:t>
       </w:r>
     </w:p>
     <w:p>
@@ -182,7 +182,7 @@
     </w:p>
     <w:p>
       <w:r>
-        <w:t>Psilocybin illustrates the standard. In a controlled human PET study, oral psilocybin produced dose-related 5-HT2A occupancy through its active metabolite psilocin; plasma psilocin, occupancy, and subjective psychedelic intensity were closely associated [4]. This is materially stronger than a molecule merely appearing in a plant or sharing a broad “psychoactive” label.</w:t>
+        <w:t>Psilocybin illustrates the standard. In a controlled human PET study, oral psilocybin produced dose-related 5-HT2A occupancy through its active metabolite psilocin; plasma psilocin, occupancy, and subjective psychedelic intensity were closely associated (Madsen et al., 2019). This is materially stronger than a molecule merely appearing in a plant or sharing a broad “psychoactive” label.</w:t>
       </w:r>
     </w:p>
     <w:p>
@@ -458,7 +458,7 @@
     </w:p>
     <w:p>
       <w:r>
-        <w:t>The repository COA is a provisional, repository-provided analytical artifact describing one Swiss-style absinthe verte analyzed by HS-SPME/GC–MS [1,2]. Its table lists 27 identified volatile rows and reports a summary total of 91.2 area% with 8.8% unidentified peaks. The curated study inventory contains 26 of those volatile rows plus three nonvolatile profile entries; p-cymene (CAS 99-87-6) is presently excluded pending identity-resolution reconciliation. The displayed source-row values sum differently because of rounding or source-table inconsistency, so the source-reported total is retained rather than recomputed. The dominant reported constituent is trans-anethole at 72.4 area% and 868.8 mg/L. Fenchone is reported at 8.7 area% and 104.4 mg/L. Alpha- and beta-thujone are reported at 14.4 and 7.2 mg/L, respectively, for a combined 21.6 mg/L. These values are repository observations, not independent measurements generated for this study.</w:t>
+        <w:t>The repository COA is a provisional, repository-provided analytical artifact describing one Swiss-style absinthe verte analyzed by HS-SPME/GC–MS (Terpedia, n.d.-a, n.d.-b). Its table lists 27 identified volatile rows and reports a summary total of 91.2 area% with 8.8% unidentified peaks. The curated study inventory contains 26 of those volatile rows plus three nonvolatile profile entries; p-cymene (CAS 99-87-6) is presently excluded pending identity-resolution reconciliation. The displayed source-row values sum differently because of rounding or source-table inconsistency, so the source-reported total is retained rather than recomputed. The dominant reported constituent is trans-anethole at 72.4 area% and 868.8 mg/L. Fenchone is reported at 8.7 area% and 104.4 mg/L. Alpha- and beta-thujone are reported at 14.4 and 7.2 mg/L, respectively, for a combined 21.6 mg/L. These values are repository observations, not independent measurements generated for this study.</w:t>
       </w:r>
     </w:p>
     <w:p>
@@ -484,7 +484,7 @@
     </w:p>
     <w:p>
       <w:r>
-        <w:t>The strongest direct mechanistic evidence in the absinthe literature concerns alpha-thujone at the GABA-A receptor picrotoxin/convulsant site; evidence for beta-thujone is more limited and isomer-qualified. The foundational PNAS work reported competitive inhibition of a radiolabeled convulsant ligand and reversible blockade of GABA-A chloride currents. In that study, alpha-thujone had an [3H]EBOB-binding IC50 of 13 ± 4 μM and a GABA-current IC50 of approximately 21 μM; beta-thujone had an [3H]EBOB-binding IC50 of 29 ± 8 μM, making the beta-isomer less potent in that binding assay [6,7]. The associated phenotype is reduced inhibitory neurotransmission and, at sufficiently high exposure, excitation and convulsions. These findings support toxicological mechanism, not a psychedelic phenotype. This is a toxicological/analeptic mechanism, not evidence of 5-HT2A agonism.</w:t>
+        <w:t>The strongest direct mechanistic evidence in the absinthe literature concerns alpha-thujone at the GABA-A receptor picrotoxin/convulsant site; evidence for beta-thujone is more limited and isomer-qualified. The foundational PNAS work reported competitive inhibition of a radiolabeled convulsant ligand and reversible blockade of GABA-A chloride currents. In that study, alpha-thujone had an [3H]EBOB-binding IC50 of 13 ± 4 μM and a GABA-current IC50 of approximately 21 μM; beta-thujone had an [3H]EBOB-binding IC50 of 29 ± 8 μM, making the beta-isomer less potent in that binding assay (Höld et al., 2000; Olsen, 2000). The associated phenotype is reduced inhibitory neurotransmission and, at sufficiently high exposure, excitation and convulsions. These findings support toxicological mechanism, not a psychedelic phenotype. This is a toxicological/analeptic mechanism, not evidence of 5-HT2A agonism.</w:t>
       </w:r>
     </w:p>
     <w:p>
@@ -515,7 +515,7 @@
     </w:p>
     <w:p>
       <w:r>
-        <w:t>Trans-anethole is the dominant reported volatile in the repository COA. Terpedia's compound record emphasizes aroma, metabolism, and preclinical pharmacology rather than 5-HT2A agonism. A primary study reports selective, nonelectrophilic agonism of human TRPA1 by trans-anethole [12]. Linalool has preclinical GABA-A-relevant literature [11], but that is not equivalent to a classic psychedelic mechanism. Estragole and methyleugenol raise toxicological questions; limonene, pinene, myrcene, cineole, aldehydes, and sesquiterpenes contribute to a chemically complex mixture. The correct conclusion for this group is not “inactive,” but “no established classic psychedelic evidence in the current Terpedia record.”</w:t>
+        <w:t>Trans-anethole is the dominant reported volatile in the repository COA. Terpedia's compound record emphasizes aroma, metabolism, and preclinical pharmacology rather than 5-HT2A agonism. A primary study reports selective, nonelectrophilic agonism of human TRPA1 by trans-anethole (Memon et al., 2019). Linalool has preclinical GABA-A-relevant literature (Höld et al., 2017), but that is not equivalent to a classic psychedelic mechanism. Estragole and methyleugenol raise toxicological questions; limonene, pinene, myrcene, cineole, aldehydes, and sesquiterpenes contribute to a chemically complex mixture. The correct conclusion for this group is not “inactive,” but “no established classic psychedelic evidence in the current Terpedia record.”</w:t>
       </w:r>
     </w:p>
     <w:p>
@@ -855,7 +855,7 @@
                 <w:rFonts w:ascii="Times New Roman" w:hAnsi="Times New Roman"/>
                 <w:sz w:val="17"/>
               </w:rPr>
-              <w:t>Direct binding and electrophysiology support channel blockade/modulation [6,7]</w:t>
+              <w:t>Direct binding and electrophysiology support channel blockade/modulation (Höld et al., 2000; Olsen, 2000)</w:t>
             </w:r>
           </w:p>
         </w:tc>
@@ -1021,7 +1021,7 @@
                 <w:rFonts w:ascii="Times New Roman" w:hAnsi="Times New Roman"/>
                 <w:sz w:val="17"/>
               </w:rPr>
-              <w:t>Functional expression studies identify (-)-alpha-thujone as a human TAS2R14 ligand [17]</w:t>
+              <w:t>Functional expression studies identify (-)-alpha-thujone as a human TAS2R14 ligand (Behrens et al., 2004)</w:t>
             </w:r>
           </w:p>
         </w:tc>
@@ -1184,7 +1184,7 @@
                 <w:rFonts w:ascii="Times New Roman" w:hAnsi="Times New Roman"/>
                 <w:sz w:val="17"/>
               </w:rPr>
-              <w:t>Mixed-isomer binding evidence; beta-specific functional potency remains incompletely resolved [6]</w:t>
+              <w:t>Mixed-isomer binding evidence; beta-specific functional potency remains incompletely resolved (Höld et al., 2000)</w:t>
             </w:r>
           </w:p>
         </w:tc>
@@ -1350,7 +1350,7 @@
                 <w:rFonts w:ascii="Times New Roman" w:hAnsi="Times New Roman"/>
                 <w:sz w:val="17"/>
               </w:rPr>
-              <w:t>Functional agonism at recombinant human TRPA1 and cellular systems [12]</w:t>
+              <w:t>Functional agonism at recombinant human TRPA1 and cellular systems (Memon et al., 2019)</w:t>
             </w:r>
           </w:p>
         </w:tc>
@@ -1513,7 +1513,7 @@
                 <w:rFonts w:ascii="Times New Roman" w:hAnsi="Times New Roman"/>
                 <w:sz w:val="17"/>
               </w:rPr>
-              <w:t>Preclinical modulation has been reported, but exact isomer, direction, potency, and CNS exposure remain unresolved [11]</w:t>
+              <w:t>Preclinical modulation has been reported, but exact isomer, direction, potency, and CNS exposure remain unresolved (Höld et al., 2017)</w:t>
             </w:r>
           </w:p>
         </w:tc>
@@ -1679,7 +1679,7 @@
                 <w:rFonts w:ascii="Times New Roman" w:hAnsi="Times New Roman"/>
                 <w:sz w:val="17"/>
               </w:rPr>
-              <w:t>Absinthin is a characterized human TAS2R46 agonist in cellular studies [18]</w:t>
+              <w:t>Absinthin is a characterized human TAS2R46 agonist in cellular studies (Talmon et al., 2019)</w:t>
             </w:r>
           </w:p>
         </w:tc>
@@ -2067,7 +2067,7 @@
     </w:p>
     <w:p>
       <w:r>
-        <w:t>The traditional “digestif” reputation of wormwood and absinthe warrants a gastrointestinal mechanism section [1], but it should not be conflated with psychedelic pharmacology. Human gastrointestinal mucosa expresses bitter taste GPCRs (TAS2Rs) on enteroendocrine and other epithelial cells. Bitter-ligand stimulation can alter intracellular calcium signaling and the release of gut peptides such as cholecystokinin (CCK), GLP-1, PYY, and ghrelin; these signals can influence gastric emptying, motility, satiation, nutrient handling, and gut–brain communication [16]. The direction and magnitude of these effects depend on receptor subtype, ligand, dose, gut location, and species.</w:t>
+        <w:t>The traditional “digestif” reputation of wormwood and absinthe warrants a gastrointestinal mechanism section (Terpedia, n.d.-a), but it should not be conflated with psychedelic pharmacology. Human gastrointestinal mucosa expresses bitter taste GPCRs (TAS2Rs) on enteroendocrine and other epithelial cells. Bitter-ligand stimulation can alter intracellular calcium signaling and the release of gut peptides such as cholecystokinin (CCK), GLP-1, PYY, and ghrelin; these signals can influence gastric emptying, motility, satiation, nutrient handling, and gut–brain communication (Sternini &amp; Rozengurt, 2025). The direction and magnitude of these effects depend on receptor subtype, ligand, dose, gut location, and species.</w:t>
       </w:r>
     </w:p>
     <w:tbl>
@@ -2267,7 +2267,7 @@
                 <w:rFonts w:ascii="Times New Roman" w:hAnsi="Times New Roman"/>
                 <w:sz w:val="17"/>
               </w:rPr>
-              <w:t>Alpha-thujone–TAS2R14 and absinthin–TAS2R46 are supported by ligand/receptor studies [17,18]; preparation-level gut exposure and effects remain unestablished</w:t>
+              <w:t>Alpha-thujone–TAS2R14 and absinthin–TAS2R46 are supported by ligand/receptor studies (Behrens et al., 2004; Talmon et al., 2019); preparation-level gut exposure and effects remain unestablished</w:t>
             </w:r>
           </w:p>
         </w:tc>
@@ -2368,7 +2368,7 @@
                 <w:rFonts w:ascii="Times New Roman" w:hAnsi="Times New Roman"/>
                 <w:sz w:val="17"/>
               </w:rPr>
-              <w:t>Trans-anethole directly activates recombinant human TRPA1 [12]; this supports sensory-neural activity, but does not establish a gut-specific effect after drinking absinthe</w:t>
+              <w:t>Trans-anethole directly activates recombinant human TRPA1 (Memon et al., 2019); this supports sensory-neural activity, but does not establish a gut-specific effect after drinking absinthe</w:t>
             </w:r>
           </w:p>
         </w:tc>
@@ -2611,7 +2611,7 @@
     </w:p>
     <w:p>
       <w:r>
-        <w:t>Ethanol is not a minor confounder: it is the beverage matrix and produces dose-dependent intoxication, disinhibition, sedation, memory impairment, and, with chronic exposure or withdrawal, severe neuropsychiatric effects. Acute ethanol effects are concentration-, brain-region-, receptor-subtype-, and exposure-state-dependent rather than reducible to one receptor action. At the synaptic level, ethanol can enhance selected GABA-A-mediated inhibitory signaling and inhibit NMDA-type glutamatergic signaling; at the circuit level, it alters cerebellar and hippocampal processing, prefrontal control, and mesolimbic reward signaling. Ethanol-associated dopamine release in the ventral tegmental area–nucleus accumbens pathway, together with opioid, endocannabinoid, and stress-system modulation, can change reward, salience, anxiety, and behavioral control [13]. These pathways explain why an absinthe experience may differ from a nonalcoholic botanical preparation without providing a 5-HT2A psychedelic mechanism. Absinthe effects must therefore be compared with an ethanol-matched spirit and, ideally, a botanical-matched alcohol-free or de-aromatized control. The louche changes dispersion and sensory expectation, but a visible colloidal transition is not a pharmacological assay.</w:t>
+        <w:t>Ethanol is not a minor confounder: it is the beverage matrix and produces dose-dependent intoxication, disinhibition, sedation, memory impairment, and, with chronic exposure or withdrawal, severe neuropsychiatric effects. Acute ethanol effects are concentration-, brain-region-, receptor-subtype-, and exposure-state-dependent rather than reducible to one receptor action. At the synaptic level, ethanol can enhance selected GABA-A-mediated inhibitory signaling and inhibit NMDA-type glutamatergic signaling; at the circuit level, it alters cerebellar and hippocampal processing, prefrontal control, and mesolimbic reward signaling. Ethanol-associated dopamine release in the ventral tegmental area–nucleus accumbens pathway, together with opioid, endocannabinoid, and stress-system modulation, can change reward, salience, anxiety, and behavioral control (Abrahao et al., 2017). These pathways explain why an absinthe experience may differ from a nonalcoholic botanical preparation without providing a 5-HT2A psychedelic mechanism. Absinthe effects must therefore be compared with an ethanol-matched spirit and, ideally, a botanical-matched alcohol-free or de-aromatized control. The louche changes dispersion and sensory expectation, but a visible colloidal transition is not a pharmacological assay.</w:t>
       </w:r>
     </w:p>
     <w:p>
@@ -2624,7 +2624,7 @@
     </w:p>
     <w:p>
       <w:r>
-        <w:t>Historical reviews conclude that nineteenth-century “absinthism” mixed chronic alcohol misuse with reports of seizures, hallucinations, and mental deterioration, and that wormwood oil is far more convulsant than properly manufactured absinthe [8,9]. Later chemical analyses also challenged exaggerated assumptions about historical thujone concentrations. These reviews do not prove that no absinthe preparation can alter perception. They do show why historical anecdotes cannot identify a receptor mechanism or quantify dose.</w:t>
+        <w:t>Historical reviews conclude that nineteenth-century “absinthism” mixed chronic alcohol misuse with reports of seizures, hallucinations, and mental deterioration, and that wormwood oil is far more convulsant than properly manufactured absinthe (Lachenmeier et al., 2006; Pelkonen et al., 2013). Later chemical analyses also challenged exaggerated assumptions about historical thujone concentrations. These reviews do not prove that no absinthe preparation can alter perception. They do show why historical anecdotes cannot identify a receptor mechanism or quantify dose.</w:t>
       </w:r>
     </w:p>
     <w:p>
@@ -2638,12 +2638,12 @@
         <w:t>The International</w:t>
       </w:r>
       <w:r>
-        <w:t xml:space="preserve"> in 1918, Aleister Crowley describes absinthe through the language of mystery, cult, inspiration, and altered meaning, asking what makes it a “separate cult” [14]. This is useful evidence for the existence and vocabulary of the myth—not evidence that Crowley’s reported or implied effects were pharmacologically specific. A small human exposure report later summarized by the European Medicines Agency provides a contrasting observation: two subjects consumed 110 mL of absinthe containing an estimated 3.85 mg thujone; blood alcohol exceeded 1 g/L, thujone was below the assay detection limit, and the described signs were ordinary alcohol intoxication rather than hallucination [15]. The sample is too small and the protocol too limited to exclude unusual effects, but it does not provide positive evidence for a robust psychedelic syndrome.</w:t>
+        <w:t xml:space="preserve"> in 1918, Aleister Crowley describes absinthe through the language of mystery, cult, inspiration, and altered meaning, asking what makes it a “separate cult” (Crowley, 1918). This is useful evidence for the existence and vocabulary of the myth—not evidence that Crowley’s reported or implied effects were pharmacologically specific. A small human exposure report later summarized by the European Medicines Agency provides a contrasting observation: two subjects consumed 110 mL of absinthe containing an estimated 3.85 mg thujone; blood alcohol exceeded 1 g/L, thujone was below the assay detection limit, and the described signs were ordinary alcohol intoxication rather than hallucination (European Medicines Agency, n.d.). The sample is too small and the protocol too limited to exclude unusual effects, but it does not provide positive evidence for a robust psychedelic syndrome.</w:t>
       </w:r>
     </w:p>
     <w:p>
       <w:r>
-        <w:t>One directly relevant human study did test absinthe-like drinks under matched alcohol conditions. Dettling and colleagues administered drinks containing identical alcohol amounts but 0, 10, or 100 mg/L thujone to 25 healthy volunteers and measured attention and mood [10]. The high-thujone condition impaired peripheral attention and temporarily counteracted alcohol's anxiolytic effect; the low-thujone condition did not show those effects. This supports a dose-dependent interaction between thujone and alcohol-related CNS effects, but the endpoints were attention and mood, not validated psychedelic phenomenology, and the study did not establish 5-HT2A involvement.</w:t>
+        <w:t>One directly relevant human study did test absinthe-like drinks under matched alcohol conditions. Dettling and colleagues administered drinks containing identical alcohol amounts but 0, 10, or 100 mg/L thujone to 25 healthy volunteers and measured attention and mood (Dettling et al., 2004). The high-thujone condition impaired peripheral attention and temporarily counteracted alcohol's anxiolytic effect; the low-thujone condition did not show those effects. This supports a dose-dependent interaction between thujone and alcohol-related CNS effects, but the endpoints were attention and mood, not validated psychedelic phenomenology, and the study did not establish 5-HT2A involvement.</w:t>
       </w:r>
     </w:p>
     <w:p>
@@ -4146,284 +4146,64 @@
       </w:r>
     </w:p>
     <w:p>
-      <w:pPr>
-        <w:pStyle w:val="ListNumber"/>
-        <w:spacing w:line="480" w:lineRule="auto"/>
-      </w:pPr>
       <w:r>
-        <w:t xml:space="preserve">Terpedia. </w:t>
+        <w:t xml:space="preserve">Abrahao, K. P., Salinas, A. G., &amp; Lovinger, D. M. (2017). Alcohol and the brain: Neuronal molecular targets, synapses, and circuits. </w:t>
       </w:r>
       <w:r>
         <w:rPr>
           <w:i/>
         </w:rPr>
-        <w:t>Absinthe: Herbal Ingredients &amp; Bioactive Compounds</w:t>
+        <w:t>Neuron, 96</w:t>
       </w:r>
       <w:r>
-        <w:t xml:space="preserve">. Local source artifact: </w:t>
-      </w:r>
-      <w:r>
-        <w:rPr>
-          <w:rFonts w:ascii="Courier New" w:hAnsi="Courier New"/>
-          <w:sz w:val="20"/>
-        </w:rPr>
-        <w:t>../functional-flavors/absinthe.html</w:t>
-      </w:r>
-      <w:r>
-        <w:t>.</w:t>
+        <w:t>, 1223–1238. https://doi.org/10.1016/j.neuron.2017.10.032</w:t>
       </w:r>
     </w:p>
     <w:p>
-      <w:pPr>
-        <w:pStyle w:val="ListNumber"/>
-        <w:spacing w:line="480" w:lineRule="auto"/>
-      </w:pPr>
       <w:r>
-        <w:t xml:space="preserve">Terpedia. </w:t>
+        <w:t xml:space="preserve">Behrens, M., Brockhoff, A., Kühn, C., Bufe, B., Winnig, M., &amp; Meyerhof, W. (2004). The human taste receptor hTAS2R14 responds to a variety of different bitter compounds. </w:t>
       </w:r>
       <w:r>
         <w:rPr>
           <w:i/>
         </w:rPr>
-        <w:t>GC-MS Certificate of Analysis — Absinthe (Traditional Verte)</w:t>
+        <w:t>Biochemical and Biophysical Research Communications, 319</w:t>
       </w:r>
       <w:r>
-        <w:t xml:space="preserve">. Local source artifact: </w:t>
-      </w:r>
-      <w:r>
-        <w:rPr>
-          <w:rFonts w:ascii="Courier New" w:hAnsi="Courier New"/>
-          <w:sz w:val="20"/>
-        </w:rPr>
-        <w:t>../functional-flavors/absinthe-coa.html</w:t>
-      </w:r>
-      <w:r>
-        <w:t>.</w:t>
+        <w:t>, 479–485. https://doi.org/10.1016/j.bbrc.2004.05.019</w:t>
       </w:r>
     </w:p>
     <w:p>
-      <w:pPr>
-        <w:pStyle w:val="ListNumber"/>
-        <w:spacing w:line="480" w:lineRule="auto"/>
-      </w:pPr>
       <w:r>
-        <w:t xml:space="preserve">Nichols DE. Psychedelics. </w:t>
+        <w:t xml:space="preserve">Crowley, A. (1918). Absinthe: The green goddess. </w:t>
       </w:r>
       <w:r>
         <w:rPr>
           <w:i/>
         </w:rPr>
-        <w:t>Pharmacol Rev</w:t>
+        <w:t>The International, 12</w:t>
       </w:r>
       <w:r>
-        <w:t>. 2016;68:264–355. https://doi.org/10.1124/pr.115.011478</w:t>
+        <w:t>(2). https://hermetic.com/crowley/international/xii/2/absinthe-the-green-goddess</w:t>
       </w:r>
     </w:p>
     <w:p>
-      <w:pPr>
-        <w:pStyle w:val="ListNumber"/>
-        <w:spacing w:line="480" w:lineRule="auto"/>
-      </w:pPr>
       <w:r>
-        <w:t xml:space="preserve">Madsen MK, et al. Psychedelic effects of psilocybin correlate with serotonin 2A receptor occupancy and plasma psilocin levels. </w:t>
+        <w:t xml:space="preserve">Dettling, A., et al. (2004). Absinthe: Attention performance and mood under the influence of thujone. </w:t>
       </w:r>
       <w:r>
         <w:rPr>
           <w:i/>
         </w:rPr>
-        <w:t>Neuropsychopharmacology</w:t>
+        <w:t>Journal of Studies on Alcohol, 65</w:t>
       </w:r>
       <w:r>
-        <w:t>. 2019;44:1328–1334. https://pmc.ncbi.nlm.nih.gov/articles/PMC6785028/</w:t>
+        <w:t>, 573–581. https://pubmed.ncbi.nlm.nih.gov/15536765/</w:t>
       </w:r>
     </w:p>
     <w:p>
-      <w:pPr>
-        <w:pStyle w:val="ListNumber"/>
-        <w:spacing w:line="480" w:lineRule="auto"/>
-      </w:pPr>
       <w:r>
-        <w:t xml:space="preserve">González-Maeso J, et al. Hallucinogens recruit specific cortical 5-HT2A receptor-mediated signaling pathways. </w:t>
-      </w:r>
-      <w:r>
-        <w:rPr>
-          <w:i/>
-        </w:rPr>
-        <w:t>Neuron</w:t>
-      </w:r>
-      <w:r>
-        <w:t>. 2007;53:439–452. https://doi.org/10.1016/j.neuron.2007.01.008</w:t>
-      </w:r>
-    </w:p>
-    <w:p>
-      <w:pPr>
-        <w:pStyle w:val="ListNumber"/>
-        <w:spacing w:line="480" w:lineRule="auto"/>
-      </w:pPr>
-      <w:r>
-        <w:t xml:space="preserve">Höld KM, et al. Alpha-thujone: GABA-A receptor modulation and metabolic detoxification. </w:t>
-      </w:r>
-      <w:r>
-        <w:rPr>
-          <w:i/>
-        </w:rPr>
-        <w:t>PNAS</w:t>
-      </w:r>
-      <w:r>
-        <w:t>. 2000;97:3826–3831. https://pmc.ncbi.nlm.nih.gov/articles/PMC18101/</w:t>
-      </w:r>
-    </w:p>
-    <w:p>
-      <w:pPr>
-        <w:pStyle w:val="ListNumber"/>
-        <w:spacing w:line="480" w:lineRule="auto"/>
-      </w:pPr>
-      <w:r>
-        <w:t xml:space="preserve">Olsen RW. Absinthe and gamma-aminobutyric acid receptors. </w:t>
-      </w:r>
-      <w:r>
-        <w:rPr>
-          <w:i/>
-        </w:rPr>
-        <w:t>PNAS</w:t>
-      </w:r>
-      <w:r>
-        <w:t>. 2000;97:4417–4418. https://pmc.ncbi.nlm.nih.gov/articles/PMC34311/</w:t>
-      </w:r>
-    </w:p>
-    <w:p>
-      <w:pPr>
-        <w:pStyle w:val="ListNumber"/>
-        <w:spacing w:line="480" w:lineRule="auto"/>
-      </w:pPr>
-      <w:r>
-        <w:t xml:space="preserve">Lachenmeier DW, et al. Absinthism: a fictitious 19th century syndrome with present impact. </w:t>
-      </w:r>
-      <w:r>
-        <w:rPr>
-          <w:i/>
-        </w:rPr>
-        <w:t>Subst Abuse Treat Prev Policy</w:t>
-      </w:r>
-      <w:r>
-        <w:t>. 2006;1:14. https://pmc.ncbi.nlm.nih.gov/articles/PMC1475830/</w:t>
-      </w:r>
-    </w:p>
-    <w:p>
-      <w:pPr>
-        <w:pStyle w:val="ListNumber"/>
-        <w:spacing w:line="480" w:lineRule="auto"/>
-      </w:pPr>
-      <w:r>
-        <w:t xml:space="preserve">Pelkonen O, Abass K, Wiesner J. Thujone and thujone-containing herbal medicinal and botanical products: toxicological assessment. </w:t>
-      </w:r>
-      <w:r>
-        <w:rPr>
-          <w:i/>
-        </w:rPr>
-        <w:t>Regul Toxicol Pharmacol</w:t>
-      </w:r>
-      <w:r>
-        <w:t>. 2013;65:100–107. https://pubmed.ncbi.nlm.nih.gov/23201408/</w:t>
-      </w:r>
-    </w:p>
-    <w:p>
-      <w:pPr>
-        <w:pStyle w:val="ListNumber"/>
-        <w:spacing w:line="480" w:lineRule="auto"/>
-      </w:pPr>
-      <w:r>
-        <w:t xml:space="preserve">Dettling A, et al. Absinthe: attention performance and mood under the influence of thujone. </w:t>
-      </w:r>
-      <w:r>
-        <w:rPr>
-          <w:i/>
-        </w:rPr>
-        <w:t>J Stud Alcohol</w:t>
-      </w:r>
-      <w:r>
-        <w:t>. 2004;65:573–581. https://pubmed.ncbi.nlm.nih.gov/15536765/</w:t>
-      </w:r>
-    </w:p>
-    <w:p>
-      <w:pPr>
-        <w:pStyle w:val="ListNumber"/>
-        <w:spacing w:line="480" w:lineRule="auto"/>
-      </w:pPr>
-      <w:r>
-        <w:t xml:space="preserve">Höld KM, et al. Metabolic Products of Linalool and Modulation of GABA_A Receptors. </w:t>
-      </w:r>
-      <w:r>
-        <w:rPr>
-          <w:i/>
-        </w:rPr>
-        <w:t>Front Chem</w:t>
-      </w:r>
-      <w:r>
-        <w:t>. 2017;5:46. https://pmc.ncbi.nlm.nih.gov/articles/PMC5478857/</w:t>
-      </w:r>
-    </w:p>
-    <w:p>
-      <w:pPr>
-        <w:pStyle w:val="ListNumber"/>
-        <w:spacing w:line="480" w:lineRule="auto"/>
-      </w:pPr>
-      <w:r>
-        <w:t xml:space="preserve">Memon T, et al. trans-Anethole of Fennel Oil is a Selective and Nonelectrophilic Agonist of the TRPA1 Ion Channel. </w:t>
-      </w:r>
-      <w:r>
-        <w:rPr>
-          <w:i/>
-        </w:rPr>
-        <w:t>Mol Pharmacol</w:t>
-      </w:r>
-      <w:r>
-        <w:t>. 2019;95:433–441. https://pmc.ncbi.nlm.nih.gov/articles/PMC6408737/</w:t>
-      </w:r>
-    </w:p>
-    <w:p>
-      <w:pPr>
-        <w:pStyle w:val="ListNumber"/>
-        <w:spacing w:line="480" w:lineRule="auto"/>
-      </w:pPr>
-      <w:r>
-        <w:t xml:space="preserve">Abrahao KP, Salinas AG, Lovinger DM. Alcohol and the brain: neuronal molecular targets, synapses, and circuits. </w:t>
-      </w:r>
-      <w:r>
-        <w:rPr>
-          <w:i/>
-        </w:rPr>
-        <w:t>Neuron</w:t>
-      </w:r>
-      <w:r>
-        <w:t>. 2017;96:1223–1238. https://doi.org/10.1016/j.neuron.2017.10.032</w:t>
-      </w:r>
-    </w:p>
-    <w:p>
-      <w:pPr>
-        <w:pStyle w:val="ListNumber"/>
-        <w:spacing w:line="480" w:lineRule="auto"/>
-      </w:pPr>
-      <w:r>
-        <w:t xml:space="preserve">Crowley A. Absinthe: The Green Goddess. </w:t>
-      </w:r>
-      <w:r>
-        <w:rPr>
-          <w:i/>
-        </w:rPr>
-        <w:t>The International</w:t>
-      </w:r>
-      <w:r>
-        <w:t>. 1918;12(2). Historical/cultural primary source: https://hermetic.com/crowley/international/xii/2/absinthe-the-green-goddess</w:t>
-      </w:r>
-    </w:p>
-    <w:p>
-      <w:pPr>
-        <w:pStyle w:val="ListNumber"/>
-        <w:spacing w:line="480" w:lineRule="auto"/>
-      </w:pPr>
-      <w:r>
-        <w:t xml:space="preserve">European Medicines Agency. </w:t>
+        <w:t xml:space="preserve">European Medicines Agency. (n.d.). </w:t>
       </w:r>
       <w:r>
         <w:rPr>
@@ -4432,97 +4212,189 @@
         <w:t>Assessment report on Artemisia absinthium L., herba</w:t>
       </w:r>
       <w:r>
-        <w:t>. Human absinthe exposure summary (Kröner et al. 2005), pp. 10–11. https://www.ema.europa.eu/en/documents/herbal-report/final-assessment-report-artemisia-absinthium-l-herba_en.pdf</w:t>
+        <w:t>. https://www.ema.europa.eu/en/documents/herbal-report/final-assessment-report-artemisia-absinthium-l-herba_en.pdf</w:t>
       </w:r>
     </w:p>
     <w:p>
-      <w:pPr>
-        <w:pStyle w:val="ListNumber"/>
-        <w:spacing w:line="480" w:lineRule="auto"/>
-      </w:pPr>
       <w:r>
-        <w:t xml:space="preserve">Sternini C, Rozengurt E. Bitter taste receptors as sensors of gut luminal contents. </w:t>
+        <w:t xml:space="preserve">González-Maeso, J., et al. (2007). Hallucinogens recruit specific cortical 5-HT2A receptor-mediated signaling pathways. </w:t>
       </w:r>
       <w:r>
         <w:rPr>
           <w:i/>
         </w:rPr>
-        <w:t>Nat Rev Gastroenterol Hepatol</w:t>
+        <w:t>Neuron, 53</w:t>
       </w:r>
       <w:r>
-        <w:t>. 2025;22:39–53. https://doi.org/10.1038/s41575-024-01005-z</w:t>
+        <w:t>, 439–452. https://doi.org/10.1016/j.neuron.2007.01.008</w:t>
       </w:r>
     </w:p>
     <w:p>
-      <w:pPr>
-        <w:pStyle w:val="ListNumber"/>
-        <w:spacing w:line="480" w:lineRule="auto"/>
-      </w:pPr>
       <w:r>
-        <w:t xml:space="preserve">Behrens M, Brockhoff A, Kühn C, et al. The human taste receptor hTAS2R14 responds to a variety of different bitter compounds. </w:t>
+        <w:t xml:space="preserve">Höld, K. M., et al. (2000). Alpha-thujone: GABA-A receptor modulation and metabolic detoxification. </w:t>
       </w:r>
       <w:r>
         <w:rPr>
           <w:i/>
         </w:rPr>
-        <w:t>Biochem Biophys Res Commun</w:t>
+        <w:t>Proceedings of the National Academy of Sciences, 97</w:t>
       </w:r>
       <w:r>
-        <w:t>. 2004;319:479–485. https://doi.org/10.1016/j.bbrc.2004.05.019</w:t>
+        <w:t>, 3826–3831. https://pmc.ncbi.nlm.nih.gov/articles/PMC18101/</w:t>
       </w:r>
     </w:p>
     <w:p>
-      <w:pPr>
-        <w:pStyle w:val="ListNumber"/>
-        <w:spacing w:line="480" w:lineRule="auto"/>
-      </w:pPr>
       <w:r>
-        <w:t xml:space="preserve">Talmon M, Rossi S, Lim D, et al. Absinthin, an agonist of the bitter taste receptor hTAS2R46, uncovers an ER-to-mitochondria Ca2+–shuttling event. </w:t>
+        <w:t xml:space="preserve">Höld, K. M., et al. (2017). Metabolic products of linalool and modulation of GABA-A receptors. </w:t>
       </w:r>
       <w:r>
         <w:rPr>
           <w:i/>
         </w:rPr>
-        <w:t>J Biol Chem</w:t>
+        <w:t>Frontiers in Chemistry, 5</w:t>
       </w:r>
       <w:r>
-        <w:t>. 2019;294:12472–12482. https://doi.org/10.1074/jbc.RA119.007763</w:t>
+        <w:t>, 46. https://pmc.ncbi.nlm.nih.gov/articles/PMC5478857/</w:t>
       </w:r>
     </w:p>
     <w:p>
-      <w:pPr>
-        <w:pStyle w:val="ListNumber"/>
-        <w:spacing w:line="480" w:lineRule="auto"/>
-      </w:pPr>
       <w:r>
-        <w:t xml:space="preserve">Behrens M, Brockhoff A, Kühn C, et al. The human taste receptor hTAS2R14 responds to a variety of different bitter compounds. </w:t>
+        <w:t xml:space="preserve">Lachenmeier, D. W., et al. (2006). Absinthism: A fictitious 19th century syndrome with present impact. </w:t>
       </w:r>
       <w:r>
         <w:rPr>
           <w:i/>
         </w:rPr>
-        <w:t>Biochem Biophys Res Commun</w:t>
+        <w:t>Substance Abuse Treatment, Prevention, and Policy, 1</w:t>
       </w:r>
       <w:r>
-        <w:t>. 2004;319:479–485. https://doi.org/10.1016/j.bbrc.2004.05.019</w:t>
+        <w:t>, 14. https://pmc.ncbi.nlm.nih.gov/articles/PMC1475830/</w:t>
       </w:r>
     </w:p>
     <w:p>
-      <w:pPr>
-        <w:pStyle w:val="ListNumber"/>
-        <w:spacing w:line="480" w:lineRule="auto"/>
-      </w:pPr>
       <w:r>
-        <w:t xml:space="preserve">Talmon M, Rossi S, Lim D, et al. Absinthin, an agonist of the bitter taste receptor hTAS2R46, uncovers an ER-to-mitochondria Ca2+–shuttling event. </w:t>
+        <w:t xml:space="preserve">Madsen, M. K., et al. (2019). Psychedelic effects of psilocybin correlate with serotonin 2A receptor occupancy and plasma psilocin levels. </w:t>
       </w:r>
       <w:r>
         <w:rPr>
           <w:i/>
         </w:rPr>
-        <w:t>J Biol Chem</w:t>
+        <w:t>Neuropsychopharmacology, 44</w:t>
       </w:r>
       <w:r>
-        <w:t>. 2019;294:12472–12482. https://doi.org/10.1074/jbc.RA119.007763</w:t>
+        <w:t>, 1328–1334. https://pmc.ncbi.nlm.nih.gov/articles/PMC6785028/</w:t>
+      </w:r>
+    </w:p>
+    <w:p>
+      <w:r>
+        <w:t xml:space="preserve">Memon, T., et al. (2019). trans-Anethole of fennel oil is a selective and nonelectrophilic agonist of the TRPA1 ion channel. </w:t>
+      </w:r>
+      <w:r>
+        <w:rPr>
+          <w:i/>
+        </w:rPr>
+        <w:t>Molecular Pharmacology, 95</w:t>
+      </w:r>
+      <w:r>
+        <w:t>, 433–441. https://pmc.ncbi.nlm.nih.gov/articles/PMC6408737/</w:t>
+      </w:r>
+    </w:p>
+    <w:p>
+      <w:r>
+        <w:t xml:space="preserve">Nichols, D. E. (2016). Psychedelics. </w:t>
+      </w:r>
+      <w:r>
+        <w:rPr>
+          <w:i/>
+        </w:rPr>
+        <w:t>Pharmacological Reviews, 68</w:t>
+      </w:r>
+      <w:r>
+        <w:t>, 264–355. https://doi.org/10.1124/pr.115.011478</w:t>
+      </w:r>
+    </w:p>
+    <w:p>
+      <w:r>
+        <w:t xml:space="preserve">Olsen, R. W. (2000). Absinthe and gamma-aminobutyric acid receptors. </w:t>
+      </w:r>
+      <w:r>
+        <w:rPr>
+          <w:i/>
+        </w:rPr>
+        <w:t>Proceedings of the National Academy of Sciences, 97</w:t>
+      </w:r>
+      <w:r>
+        <w:t>, 4417–4418. https://pmc.ncbi.nlm.nih.gov/articles/PMC34311/</w:t>
+      </w:r>
+    </w:p>
+    <w:p>
+      <w:r>
+        <w:t xml:space="preserve">Pelkonen, O., Abass, K., &amp; Wiesner, J. (2013). Thujone and thujone-containing herbal medicinal and botanical products: Toxicological assessment. </w:t>
+      </w:r>
+      <w:r>
+        <w:rPr>
+          <w:i/>
+        </w:rPr>
+        <w:t>Regulatory Toxicology and Pharmacology, 65</w:t>
+      </w:r>
+      <w:r>
+        <w:t>, 100–107. https://pubmed.ncbi.nlm.nih.gov/23201408/</w:t>
+      </w:r>
+    </w:p>
+    <w:p>
+      <w:r>
+        <w:t xml:space="preserve">Sternini, C., &amp; Rozengurt, E. (2025). Bitter taste receptors as sensors of gut luminal contents. </w:t>
+      </w:r>
+      <w:r>
+        <w:rPr>
+          <w:i/>
+        </w:rPr>
+        <w:t>Nature Reviews Gastroenterology &amp; Hepatology, 22</w:t>
+      </w:r>
+      <w:r>
+        <w:t>, 39–53. https://doi.org/10.1038/s41575-024-01005-z</w:t>
+      </w:r>
+    </w:p>
+    <w:p>
+      <w:r>
+        <w:t xml:space="preserve">Talmon, M., et al. (2019). Absinthin, an agonist of the bitter taste receptor hTAS2R46, uncovers an ER-to-mitochondria Ca2+–shuttling event. </w:t>
+      </w:r>
+      <w:r>
+        <w:rPr>
+          <w:i/>
+        </w:rPr>
+        <w:t>Journal of Biological Chemistry, 294</w:t>
+      </w:r>
+      <w:r>
+        <w:t>, 12472–12482. https://doi.org/10.1074/jbc.RA119.007763</w:t>
+      </w:r>
+    </w:p>
+    <w:p>
+      <w:r>
+        <w:t xml:space="preserve">Terpedia. (n.d.-a). </w:t>
+      </w:r>
+      <w:r>
+        <w:rPr>
+          <w:i/>
+        </w:rPr>
+        <w:t>Absinthe: Herbal ingredients &amp; bioactive compounds</w:t>
+      </w:r>
+      <w:r>
+        <w:t xml:space="preserve"> [Terpedia source artifact].</w:t>
+      </w:r>
+    </w:p>
+    <w:p>
+      <w:r>
+        <w:t xml:space="preserve">Terpedia. (n.d.-b). </w:t>
+      </w:r>
+      <w:r>
+        <w:rPr>
+          <w:i/>
+        </w:rPr>
+        <w:t>GC-MS certificate of analysis: Absinthe traditional verte</w:t>
+      </w:r>
+      <w:r>
+        <w:t xml:space="preserve"> [Terpedia source artifact].</w:t>
       </w:r>
     </w:p>
     <w:sectPr>

</xml_diff>

<commit_message>
chore: sync local updates for manuscript/research work
</commit_message>
<xml_diff>
--- a/manuscript/jps-formatted/absinthe-jps-blinded-manuscript.docx
+++ b/manuscript/jps-formatted/absinthe-jps-blinded-manuscript.docx
@@ -4146,6 +4146,9 @@
       </w:r>
     </w:p>
     <w:p>
+      <w:pPr>
+        <w:ind w:left="504" w:hanging="504"/>
+      </w:pPr>
       <w:r>
         <w:t xml:space="preserve">Abrahao, K. P., Salinas, A. G., &amp; Lovinger, D. M. (2017). Alcohol and the brain: Neuronal molecular targets, synapses, and circuits. </w:t>
       </w:r>
@@ -4160,6 +4163,9 @@
       </w:r>
     </w:p>
     <w:p>
+      <w:pPr>
+        <w:ind w:left="504" w:hanging="504"/>
+      </w:pPr>
       <w:r>
         <w:t xml:space="preserve">Behrens, M., Brockhoff, A., Kühn, C., Bufe, B., Winnig, M., &amp; Meyerhof, W. (2004). The human taste receptor hTAS2R14 responds to a variety of different bitter compounds. </w:t>
       </w:r>
@@ -4174,6 +4180,9 @@
       </w:r>
     </w:p>
     <w:p>
+      <w:pPr>
+        <w:ind w:left="504" w:hanging="504"/>
+      </w:pPr>
       <w:r>
         <w:t xml:space="preserve">Crowley, A. (1918). Absinthe: The green goddess. </w:t>
       </w:r>
@@ -4188,6 +4197,9 @@
       </w:r>
     </w:p>
     <w:p>
+      <w:pPr>
+        <w:ind w:left="504" w:hanging="504"/>
+      </w:pPr>
       <w:r>
         <w:t xml:space="preserve">Dettling, A., et al. (2004). Absinthe: Attention performance and mood under the influence of thujone. </w:t>
       </w:r>
@@ -4202,6 +4214,9 @@
       </w:r>
     </w:p>
     <w:p>
+      <w:pPr>
+        <w:ind w:left="504" w:hanging="504"/>
+      </w:pPr>
       <w:r>
         <w:t xml:space="preserve">European Medicines Agency. (n.d.). </w:t>
       </w:r>
@@ -4216,6 +4231,9 @@
       </w:r>
     </w:p>
     <w:p>
+      <w:pPr>
+        <w:ind w:left="504" w:hanging="504"/>
+      </w:pPr>
       <w:r>
         <w:t xml:space="preserve">González-Maeso, J., et al. (2007). Hallucinogens recruit specific cortical 5-HT2A receptor-mediated signaling pathways. </w:t>
       </w:r>
@@ -4230,6 +4248,9 @@
       </w:r>
     </w:p>
     <w:p>
+      <w:pPr>
+        <w:ind w:left="504" w:hanging="504"/>
+      </w:pPr>
       <w:r>
         <w:t xml:space="preserve">Höld, K. M., et al. (2000). Alpha-thujone: GABA-A receptor modulation and metabolic detoxification. </w:t>
       </w:r>
@@ -4244,6 +4265,9 @@
       </w:r>
     </w:p>
     <w:p>
+      <w:pPr>
+        <w:ind w:left="504" w:hanging="504"/>
+      </w:pPr>
       <w:r>
         <w:t xml:space="preserve">Höld, K. M., et al. (2017). Metabolic products of linalool and modulation of GABA-A receptors. </w:t>
       </w:r>
@@ -4258,6 +4282,9 @@
       </w:r>
     </w:p>
     <w:p>
+      <w:pPr>
+        <w:ind w:left="504" w:hanging="504"/>
+      </w:pPr>
       <w:r>
         <w:t xml:space="preserve">Lachenmeier, D. W., et al. (2006). Absinthism: A fictitious 19th century syndrome with present impact. </w:t>
       </w:r>
@@ -4272,6 +4299,9 @@
       </w:r>
     </w:p>
     <w:p>
+      <w:pPr>
+        <w:ind w:left="504" w:hanging="504"/>
+      </w:pPr>
       <w:r>
         <w:t xml:space="preserve">Madsen, M. K., et al. (2019). Psychedelic effects of psilocybin correlate with serotonin 2A receptor occupancy and plasma psilocin levels. </w:t>
       </w:r>
@@ -4286,6 +4316,9 @@
       </w:r>
     </w:p>
     <w:p>
+      <w:pPr>
+        <w:ind w:left="504" w:hanging="504"/>
+      </w:pPr>
       <w:r>
         <w:t xml:space="preserve">Memon, T., et al. (2019). trans-Anethole of fennel oil is a selective and nonelectrophilic agonist of the TRPA1 ion channel. </w:t>
       </w:r>
@@ -4300,6 +4333,9 @@
       </w:r>
     </w:p>
     <w:p>
+      <w:pPr>
+        <w:ind w:left="504" w:hanging="504"/>
+      </w:pPr>
       <w:r>
         <w:t xml:space="preserve">Nichols, D. E. (2016). Psychedelics. </w:t>
       </w:r>
@@ -4314,6 +4350,9 @@
       </w:r>
     </w:p>
     <w:p>
+      <w:pPr>
+        <w:ind w:left="504" w:hanging="504"/>
+      </w:pPr>
       <w:r>
         <w:t xml:space="preserve">Olsen, R. W. (2000). Absinthe and gamma-aminobutyric acid receptors. </w:t>
       </w:r>
@@ -4328,6 +4367,9 @@
       </w:r>
     </w:p>
     <w:p>
+      <w:pPr>
+        <w:ind w:left="504" w:hanging="504"/>
+      </w:pPr>
       <w:r>
         <w:t xml:space="preserve">Pelkonen, O., Abass, K., &amp; Wiesner, J. (2013). Thujone and thujone-containing herbal medicinal and botanical products: Toxicological assessment. </w:t>
       </w:r>
@@ -4342,6 +4384,9 @@
       </w:r>
     </w:p>
     <w:p>
+      <w:pPr>
+        <w:ind w:left="504" w:hanging="504"/>
+      </w:pPr>
       <w:r>
         <w:t xml:space="preserve">Sternini, C., &amp; Rozengurt, E. (2025). Bitter taste receptors as sensors of gut luminal contents. </w:t>
       </w:r>
@@ -4356,6 +4401,9 @@
       </w:r>
     </w:p>
     <w:p>
+      <w:pPr>
+        <w:ind w:left="504" w:hanging="504"/>
+      </w:pPr>
       <w:r>
         <w:t xml:space="preserve">Talmon, M., et al. (2019). Absinthin, an agonist of the bitter taste receptor hTAS2R46, uncovers an ER-to-mitochondria Ca2+–shuttling event. </w:t>
       </w:r>
@@ -4370,6 +4418,9 @@
       </w:r>
     </w:p>
     <w:p>
+      <w:pPr>
+        <w:ind w:left="504" w:hanging="504"/>
+      </w:pPr>
       <w:r>
         <w:t xml:space="preserve">Terpedia. (n.d.-a). </w:t>
       </w:r>
@@ -4384,6 +4435,9 @@
       </w:r>
     </w:p>
     <w:p>
+      <w:pPr>
+        <w:ind w:left="504" w:hanging="504"/>
+      </w:pPr>
       <w:r>
         <w:t xml:space="preserve">Terpedia. (n.d.-b). </w:t>
       </w:r>

</xml_diff>